<commit_message>
Diario 12 marzo y update diario 25 feb
</commit_message>
<xml_diff>
--- a/DIARIOS/Sesión 25 de febrero.docx
+++ b/DIARIOS/Sesión 25 de febrero.docx
@@ -52,19 +52,11 @@
         </w:rPr>
         <w:t xml:space="preserve">Parte 1. </w:t>
       </w:r>
-      <w:proofErr w:type="spellStart"/>
       <w:r>
         <w:rPr>
           <w:u w:val="single"/>
         </w:rPr>
-        <w:t>Review</w:t>
-      </w:r>
-      <w:proofErr w:type="spellEnd"/>
-      <w:r>
-        <w:rPr>
-          <w:u w:val="single"/>
-        </w:rPr>
-        <w:t xml:space="preserve"> de trabajo previo</w:t>
+        <w:t>Review de trabajo previo</w:t>
       </w:r>
       <w:r>
         <w:rPr>
@@ -532,29 +524,8 @@
         <w:rPr>
           <w:rFonts w:eastAsiaTheme="minorEastAsia"/>
         </w:rPr>
-        <w:t xml:space="preserve"> en base a la definición de estabilidad </w:t>
-      </w:r>
-      <w:proofErr w:type="spellStart"/>
-      <w:r>
-        <w:rPr>
-          <w:rFonts w:eastAsiaTheme="minorEastAsia"/>
-        </w:rPr>
-        <w:t>Liapunov</w:t>
-      </w:r>
-      <w:proofErr w:type="spellEnd"/>
-      <w:r>
-        <w:rPr>
-          <w:rFonts w:eastAsiaTheme="minorEastAsia"/>
-        </w:rPr>
-        <w:t>. Esboza gráficos en el espacio de fases.</w:t>
-      </w:r>
-      <w:r>
-        <w:rPr>
-          <w:rFonts w:eastAsiaTheme="minorEastAsia"/>
-        </w:rPr>
-        <w:t xml:space="preserve"> </w:t>
-      </w:r>
-      <w:proofErr w:type="gramStart"/>
+        <w:t xml:space="preserve"> en base a la definición de estabilidad Liapunov. Esboza gráficos en el espacio de fases. </w:t>
+      </w:r>
       <w:r>
         <w:rPr>
           <w:rFonts w:eastAsiaTheme="minorEastAsia"/>
@@ -562,7 +533,6 @@
         </w:rPr>
         <w:t>Plotear en Python?</w:t>
       </w:r>
-      <w:proofErr w:type="gramEnd"/>
     </w:p>
     <w:p>
       <w:pPr>
@@ -592,21 +562,7 @@
         <w:rPr>
           <w:rFonts w:eastAsiaTheme="minorEastAsia"/>
         </w:rPr>
-        <w:t xml:space="preserve">Forma de las soluciones mediante el método de variación de </w:t>
-      </w:r>
-      <w:proofErr w:type="spellStart"/>
-      <w:r>
-        <w:rPr>
-          <w:rFonts w:eastAsiaTheme="minorEastAsia"/>
-        </w:rPr>
-        <w:t>Ctes</w:t>
-      </w:r>
-      <w:proofErr w:type="spellEnd"/>
-      <w:r>
-        <w:rPr>
-          <w:rFonts w:eastAsiaTheme="minorEastAsia"/>
-        </w:rPr>
-        <w:t xml:space="preserve">. </w:t>
+        <w:t xml:space="preserve">Forma de las soluciones mediante el método de variación de Ctes. </w:t>
       </w:r>
       <m:oMath>
         <m:r>
@@ -724,7 +680,6 @@
         </w:rPr>
         <w:t xml:space="preserve">Tiene problemas para acceder al </w:t>
       </w:r>
-      <w:proofErr w:type="spellStart"/>
       <w:r>
         <w:rPr>
           <w:rFonts w:eastAsiaTheme="minorEastAsia"/>
@@ -739,35 +694,24 @@
           <w:i/>
           <w:iCs/>
         </w:rPr>
-        <w:t>umerical</w:t>
-      </w:r>
-      <w:proofErr w:type="spellEnd"/>
+        <w:t xml:space="preserve">umerical </w:t>
+      </w:r>
       <w:r>
         <w:rPr>
           <w:rFonts w:eastAsiaTheme="minorEastAsia"/>
           <w:i/>
           <w:iCs/>
         </w:rPr>
-        <w:t xml:space="preserve"> </w:t>
-      </w:r>
-      <w:proofErr w:type="spellStart"/>
+        <w:t>R</w:t>
+      </w:r>
       <w:r>
         <w:rPr>
           <w:rFonts w:eastAsiaTheme="minorEastAsia"/>
           <w:i/>
           <w:iCs/>
         </w:rPr>
-        <w:t>R</w:t>
-      </w:r>
-      <w:r>
-        <w:rPr>
-          <w:rFonts w:eastAsiaTheme="minorEastAsia"/>
-          <w:i/>
-          <w:iCs/>
-        </w:rPr>
         <w:t>ecipes</w:t>
       </w:r>
-      <w:proofErr w:type="spellEnd"/>
       <w:r>
         <w:rPr>
           <w:rFonts w:eastAsiaTheme="minorEastAsia"/>
@@ -775,42 +719,19 @@
         <w:t xml:space="preserve">. </w:t>
       </w:r>
       <w:hyperlink r:id="rId5" w:history="1">
-        <w:proofErr w:type="spellStart"/>
         <w:r>
           <w:rPr>
             <w:rStyle w:val="Hipervnculo"/>
             <w:rFonts w:eastAsiaTheme="minorEastAsia"/>
           </w:rPr>
-          <w:t>numerical.recipes</w:t>
-        </w:r>
-        <w:proofErr w:type="spellEnd"/>
-        <w:r>
-          <w:rPr>
-            <w:rStyle w:val="Hipervnculo"/>
-            <w:rFonts w:eastAsiaTheme="minorEastAsia"/>
-          </w:rPr>
-          <w:t>/book.html</w:t>
+          <w:t>numerical.recipes/book.html</w:t>
         </w:r>
       </w:hyperlink>
       <w:r>
         <w:rPr>
           <w:rFonts w:eastAsiaTheme="minorEastAsia"/>
         </w:rPr>
-        <w:t xml:space="preserve"> Runge </w:t>
-      </w:r>
-      <w:proofErr w:type="spellStart"/>
-      <w:r>
-        <w:rPr>
-          <w:rFonts w:eastAsiaTheme="minorEastAsia"/>
-        </w:rPr>
-        <w:t>Kutta</w:t>
-      </w:r>
-      <w:proofErr w:type="spellEnd"/>
-      <w:r>
-        <w:rPr>
-          <w:rFonts w:eastAsiaTheme="minorEastAsia"/>
-        </w:rPr>
-        <w:t xml:space="preserve"> en epígrafes 17.0 y 17.1</w:t>
+        <w:t xml:space="preserve"> Runge Kutta en epígrafes 17.0 y 17.1</w:t>
       </w:r>
     </w:p>
     <w:p>
@@ -845,23 +766,7 @@
         <w:rPr>
           <w:rFonts w:eastAsiaTheme="minorEastAsia"/>
         </w:rPr>
-        <w:t xml:space="preserve">Vuelvo a contarle la física tras un acelerador de partículas. Explico fuerza cuadrupolar (Slide 15 </w:t>
-      </w:r>
-      <w:proofErr w:type="spellStart"/>
-      <w:proofErr w:type="gramStart"/>
-      <w:r>
-        <w:rPr>
-          <w:rFonts w:eastAsiaTheme="minorEastAsia"/>
-        </w:rPr>
-        <w:t>A.Latina</w:t>
-      </w:r>
-      <w:proofErr w:type="spellEnd"/>
-      <w:proofErr w:type="gramEnd"/>
-      <w:r>
-        <w:rPr>
-          <w:rFonts w:eastAsiaTheme="minorEastAsia"/>
-        </w:rPr>
-        <w:t xml:space="preserve">), y vemos que un cuadrupolo con </w:t>
+        <w:t xml:space="preserve">Vuelvo a contarle la física tras un acelerador de partículas. Explico fuerza cuadrupolar (Slide 15 A.Latina), y vemos que un cuadrupolo con </w:t>
       </w:r>
       <m:oMath>
         <m:r>
@@ -921,19 +826,11 @@
           <w:rFonts w:eastAsiaTheme="minorEastAsia"/>
         </w:rPr>
       </w:pPr>
-      <w:proofErr w:type="spellStart"/>
-      <w:r>
-        <w:rPr>
-          <w:rFonts w:eastAsiaTheme="minorEastAsia"/>
-        </w:rPr>
-        <w:t>Desfocaliza</w:t>
-      </w:r>
-      <w:proofErr w:type="spellEnd"/>
-      <w:r>
-        <w:rPr>
-          <w:rFonts w:eastAsiaTheme="minorEastAsia"/>
-        </w:rPr>
-        <w:t xml:space="preserve"> en</w:t>
+      <w:r>
+        <w:rPr>
+          <w:rFonts w:eastAsiaTheme="minorEastAsia"/>
+        </w:rPr>
+        <w:t>Desfocaliza en</w:t>
       </w:r>
       <m:oMath>
         <m:r>
@@ -954,35 +851,7 @@
         <w:rPr>
           <w:rFonts w:eastAsiaTheme="minorEastAsia"/>
         </w:rPr>
-        <w:t xml:space="preserve">Le explico qué es una FODO </w:t>
-      </w:r>
-      <w:proofErr w:type="spellStart"/>
-      <w:r>
-        <w:rPr>
-          <w:rFonts w:eastAsiaTheme="minorEastAsia"/>
-        </w:rPr>
-        <w:t>Lattice</w:t>
-      </w:r>
-      <w:proofErr w:type="spellEnd"/>
-      <w:r>
-        <w:rPr>
-          <w:rFonts w:eastAsiaTheme="minorEastAsia"/>
-        </w:rPr>
-        <w:t xml:space="preserve"> (Un array periódico de </w:t>
-      </w:r>
-      <w:proofErr w:type="spellStart"/>
-      <w:r>
-        <w:rPr>
-          <w:rFonts w:eastAsiaTheme="minorEastAsia"/>
-        </w:rPr>
-        <w:t>Focusing</w:t>
-      </w:r>
-      <w:proofErr w:type="spellEnd"/>
-      <w:r>
-        <w:rPr>
-          <w:rFonts w:eastAsiaTheme="minorEastAsia"/>
-        </w:rPr>
-        <w:t xml:space="preserve"> </w:t>
+        <w:t xml:space="preserve">Le explico qué es una FODO Lattice (Un array periódico de Focusing </w:t>
       </w:r>
       <m:oMath>
         <m:r>
@@ -1010,47 +879,7 @@
         <w:rPr>
           <w:rFonts w:eastAsiaTheme="minorEastAsia"/>
         </w:rPr>
-        <w:t xml:space="preserve">) quadrupoles). Llegamos, pues, a la conclusión de </w:t>
-      </w:r>
-      <w:r>
-        <w:rPr>
-          <w:rFonts w:eastAsiaTheme="minorEastAsia"/>
-        </w:rPr>
-        <w:t>que,</w:t>
-      </w:r>
-      <w:r>
-        <w:rPr>
-          <w:rFonts w:eastAsiaTheme="minorEastAsia"/>
-        </w:rPr>
-        <w:t xml:space="preserve"> en un acelerador, la </w:t>
-      </w:r>
-      <w:proofErr w:type="spellStart"/>
-      <w:r>
-        <w:rPr>
-          <w:rFonts w:eastAsiaTheme="minorEastAsia"/>
-        </w:rPr>
-        <w:t>focusing</w:t>
-      </w:r>
-      <w:proofErr w:type="spellEnd"/>
-      <w:r>
-        <w:rPr>
-          <w:rFonts w:eastAsiaTheme="minorEastAsia"/>
-        </w:rPr>
-        <w:t xml:space="preserve"> </w:t>
-      </w:r>
-      <w:proofErr w:type="spellStart"/>
-      <w:r>
-        <w:rPr>
-          <w:rFonts w:eastAsiaTheme="minorEastAsia"/>
-        </w:rPr>
-        <w:t>strength</w:t>
-      </w:r>
-      <w:proofErr w:type="spellEnd"/>
-      <w:r>
-        <w:rPr>
-          <w:rFonts w:eastAsiaTheme="minorEastAsia"/>
-        </w:rPr>
-        <w:t xml:space="preserve">, </w:t>
+        <w:t xml:space="preserve">) quadrupoles). Llegamos, pues, a la conclusión de que, en un acelerador, la focusing strength, </w:t>
       </w:r>
       <m:oMath>
         <m:r>
@@ -1150,7 +979,13 @@
             <w:rPr>
               <w:rFonts w:ascii="Cambria Math" w:eastAsiaTheme="minorEastAsia" w:hAnsi="Cambria Math"/>
             </w:rPr>
-            <m:t>+k</m:t>
+            <m:t>+</m:t>
+          </m:r>
+          <m:r>
+            <w:rPr>
+              <w:rFonts w:ascii="Cambria Math" w:eastAsiaTheme="minorEastAsia" w:hAnsi="Cambria Math"/>
+            </w:rPr>
+            <m:t>k</m:t>
           </m:r>
           <m:d>
             <m:dPr>
@@ -1240,32 +1075,19 @@
         <w:rPr>
           <w:rFonts w:eastAsiaTheme="minorEastAsia"/>
         </w:rPr>
-        <w:t xml:space="preserve">Esta es la llamada </w:t>
-      </w:r>
-      <w:proofErr w:type="spellStart"/>
-      <w:r>
-        <w:rPr>
-          <w:rFonts w:eastAsiaTheme="minorEastAsia"/>
-        </w:rPr>
-        <w:t>Eq</w:t>
-      </w:r>
-      <w:proofErr w:type="spellEnd"/>
-      <w:r>
-        <w:rPr>
-          <w:rFonts w:eastAsiaTheme="minorEastAsia"/>
-        </w:rPr>
-        <w:t>. De Hills.</w:t>
-      </w:r>
-    </w:p>
-    <w:p>
-      <w:pPr>
-        <w:rPr>
-          <w:rFonts w:eastAsiaTheme="minorEastAsia"/>
-        </w:rPr>
-      </w:pPr>
-      <w:r>
-        <w:rPr>
-          <w:rFonts w:eastAsiaTheme="minorEastAsia"/>
+        <w:t>Esta es la llamada Eq. De Hills.</w:t>
+      </w:r>
+    </w:p>
+    <w:p>
+      <w:pPr>
+        <w:rPr>
+          <w:rFonts w:eastAsiaTheme="minorEastAsia"/>
+        </w:rPr>
+      </w:pPr>
+      <w:r>
+        <w:rPr>
+          <w:rFonts w:eastAsiaTheme="minorEastAsia"/>
+          <w:noProof/>
         </w:rPr>
         <w:lastRenderedPageBreak/>
         <w:drawing>
@@ -1732,7 +1554,13 @@
             <w:rPr>
               <w:rFonts w:ascii="Cambria Math" w:hAnsi="Cambria Math"/>
             </w:rPr>
-            <m:t>=M</m:t>
+            <m:t>=</m:t>
+          </m:r>
+          <m:r>
+            <w:rPr>
+              <w:rFonts w:ascii="Cambria Math" w:hAnsi="Cambria Math"/>
+            </w:rPr>
+            <m:t>M</m:t>
           </m:r>
           <m:d>
             <m:dPr>
@@ -1876,23 +1704,7 @@
         <w:jc w:val="both"/>
       </w:pPr>
       <w:r>
-        <w:t>Revisar teoría Runge-</w:t>
-      </w:r>
-      <w:proofErr w:type="spellStart"/>
-      <w:r>
-        <w:t>Kutta</w:t>
-      </w:r>
-      <w:proofErr w:type="spellEnd"/>
-      <w:r>
-        <w:t xml:space="preserve"> (RK): Entender formulación, distinguir distintos tipos, y ver el impacto del </w:t>
-      </w:r>
-      <w:proofErr w:type="spellStart"/>
-      <w:r>
-        <w:t>size</w:t>
-      </w:r>
-      <w:proofErr w:type="spellEnd"/>
-      <w:r>
-        <w:t>-step (a nivel teórico).</w:t>
+        <w:t>Revisar teoría Runge-Kutta (RK): Entender formulación, distinguir distintos tipos, y ver el impacto del size-step (a nivel teórico).</w:t>
       </w:r>
     </w:p>
     <w:p>
@@ -1905,15 +1717,7 @@
         <w:jc w:val="both"/>
       </w:pPr>
       <w:r>
-        <w:t xml:space="preserve">Crear Python </w:t>
-      </w:r>
-      <w:proofErr w:type="spellStart"/>
-      <w:r>
-        <w:t>routine</w:t>
-      </w:r>
-      <w:proofErr w:type="spellEnd"/>
-      <w:r>
-        <w:t xml:space="preserve"> que resuelva el oscilador armónico con RK</w:t>
+        <w:t>Crear Python routine que resuelva el oscilador armónico con RK</w:t>
       </w:r>
     </w:p>
     <w:p>
@@ -1932,15 +1736,7 @@
         <w:t>*</w:t>
       </w:r>
       <w:r>
-        <w:t xml:space="preserve">Buscar brevemente información sobre Teorema de </w:t>
-      </w:r>
-      <w:proofErr w:type="spellStart"/>
-      <w:r>
-        <w:t>Floquet</w:t>
-      </w:r>
-      <w:proofErr w:type="spellEnd"/>
-      <w:r>
-        <w:t xml:space="preserve"> (ver carpeta bibliografía, complementar si necesario) y ver qué relación tiene con la estabilidad del sistema y/o la forma de las soluciones.</w:t>
+        <w:t>Buscar brevemente información sobre Teorema de Floquet (ver carpeta bibliografía, complementar si necesario) y ver qué relación tiene con la estabilidad del sistema y/o la forma de las soluciones.</w:t>
       </w:r>
     </w:p>
     <w:p>
@@ -2166,7 +1962,13 @@
             <w:rPr>
               <w:rFonts w:ascii="Cambria Math" w:hAnsi="Cambria Math"/>
             </w:rPr>
-            <m:t>=M</m:t>
+            <m:t>=</m:t>
+          </m:r>
+          <m:r>
+            <w:rPr>
+              <w:rFonts w:ascii="Cambria Math" w:hAnsi="Cambria Math"/>
+            </w:rPr>
+            <m:t>M</m:t>
           </m:r>
           <m:d>
             <m:dPr>
@@ -2333,13 +2135,17 @@
         <w:t>*</w:t>
       </w:r>
       <w:r>
-        <w:t xml:space="preserve">Usar Criterio </w:t>
-      </w:r>
-      <w:proofErr w:type="spellStart"/>
-      <w:r>
-        <w:t>Floquet</w:t>
-      </w:r>
-      <w:proofErr w:type="spellEnd"/>
+        <w:t>Usar Criterio Floquet</w:t>
+      </w:r>
+      <w:r>
+        <w:t xml:space="preserve"> </w:t>
+      </w:r>
+      <w:r>
+        <w:sym w:font="Wingdings" w:char="F0E0"/>
+      </w:r>
+      <w:r>
+        <w:t xml:space="preserve"> Floquet me da una solución que yo puedo iterar muchas veces e imponer que no diverja</w:t>
+      </w:r>
     </w:p>
     <w:p>
       <w:pPr>
@@ -2536,19 +2342,250 @@
     <w:p>
       <w:pPr>
         <w:jc w:val="both"/>
-      </w:pPr>
-      <w:r>
         <w:rPr>
           <w:noProof/>
         </w:rPr>
-        <w:t>Proponemos vernos en dos semanas (10-13 marzo), quedo en proponer una fecha conveniente</w:t>
-      </w:r>
+      </w:pPr>
       <w:r>
         <w:rPr>
           <w:noProof/>
         </w:rPr>
-        <w:t xml:space="preserve"> a ambos.</w:t>
-      </w:r>
+        <w:lastRenderedPageBreak/>
+        <w:t>Proponemos vernos en dos semanas (10-13 marzo), quedo en proponer una fecha conveniente a ambos.</w:t>
+      </w:r>
+    </w:p>
+    <w:p>
+      <w:pPr>
+        <w:jc w:val="center"/>
+        <w:rPr>
+          <w:b/>
+          <w:bCs/>
+          <w:noProof/>
+        </w:rPr>
+      </w:pPr>
+      <w:r>
+        <w:rPr>
+          <w:b/>
+          <w:bCs/>
+          <w:noProof/>
+        </w:rPr>
+        <w:t>Ideas próximo día:</w:t>
+      </w:r>
+    </w:p>
+    <w:p>
+      <w:pPr>
+        <w:jc w:val="center"/>
+        <w:rPr>
+          <w:b/>
+          <w:bCs/>
+          <w:noProof/>
+        </w:rPr>
+      </w:pPr>
+      <w:r>
+        <w:rPr>
+          <w:b/>
+          <w:bCs/>
+          <w:noProof/>
+        </w:rPr>
+        <w:t>Anexo: Osc. Armónico (Solución y estabilidad)</w:t>
+      </w:r>
+    </w:p>
+    <w:p>
+      <w:pPr>
+        <w:jc w:val="center"/>
+        <w:rPr>
+          <w:b/>
+          <w:bCs/>
+          <w:noProof/>
+        </w:rPr>
+      </w:pPr>
+      <w:r>
+        <w:rPr>
+          <w:b/>
+          <w:bCs/>
+          <w:noProof/>
+        </w:rPr>
+        <w:t xml:space="preserve">Prioridad: Construir RK que </w:t>
+      </w:r>
+      <w:r>
+        <w:rPr>
+          <w:b/>
+          <w:bCs/>
+          <w:noProof/>
+        </w:rPr>
+        <w:t>reproduzca Eq. Hills.</w:t>
+      </w:r>
+    </w:p>
+    <w:p>
+      <w:pPr>
+        <w:jc w:val="both"/>
+        <w:rPr>
+          <w:noProof/>
+        </w:rPr>
+      </w:pPr>
+      <w:r>
+        <w:rPr>
+          <w:noProof/>
+        </w:rPr>
+        <w:t>Curvas de Liapunov: Dibujar espacio de fases y concluir que las órbitas estables son cerradas.</w:t>
+      </w:r>
+    </w:p>
+    <w:p>
+      <w:pPr>
+        <w:pStyle w:val="Prrafodelista"/>
+        <w:numPr>
+          <w:ilvl w:val="0"/>
+          <w:numId w:val="2"/>
+        </w:numPr>
+        <w:jc w:val="both"/>
+        <w:rPr>
+          <w:noProof/>
+        </w:rPr>
+      </w:pPr>
+      <w:r>
+        <w:rPr>
+          <w:noProof/>
+        </w:rPr>
+        <w:t xml:space="preserve">Tomar solución RK y </w:t>
+      </w:r>
+      <w:r>
+        <w:rPr>
+          <w:noProof/>
+        </w:rPr>
+        <w:t>dibujar espacio de fases</w:t>
+      </w:r>
+    </w:p>
+    <w:p>
+      <w:pPr>
+        <w:jc w:val="both"/>
+        <w:rPr>
+          <w:noProof/>
+        </w:rPr>
+      </w:pPr>
+      <w:r>
+        <w:rPr>
+          <w:noProof/>
+        </w:rPr>
+        <w:t xml:space="preserve">Escribir Estabilidad </w:t>
+      </w:r>
+      <w:r>
+        <w:rPr>
+          <w:noProof/>
+        </w:rPr>
+        <w:t>(Fund teórico)</w:t>
+      </w:r>
+    </w:p>
+    <w:p>
+      <w:pPr>
+        <w:jc w:val="both"/>
+        <w:rPr>
+          <w:noProof/>
+        </w:rPr>
+      </w:pPr>
+      <w:r>
+        <w:rPr>
+          <w:noProof/>
+        </w:rPr>
+        <w:t>Escribir extración EDO</w:t>
+      </w:r>
+      <w:r>
+        <w:rPr>
+          <w:noProof/>
+        </w:rPr>
+        <w:t xml:space="preserve"> lineal</w:t>
+      </w:r>
+    </w:p>
+    <w:p>
+      <w:pPr>
+        <w:pStyle w:val="Prrafodelista"/>
+        <w:numPr>
+          <w:ilvl w:val="0"/>
+          <w:numId w:val="2"/>
+        </w:numPr>
+        <w:jc w:val="both"/>
+        <w:rPr>
+          <w:noProof/>
+        </w:rPr>
+      </w:pPr>
+      <w:r>
+        <w:rPr>
+          <w:noProof/>
+        </w:rPr>
+        <w:t>Caso particular quad</w:t>
+      </w:r>
+      <w:r>
+        <w:rPr>
+          <w:noProof/>
+        </w:rPr>
+        <w:t>.</w:t>
+      </w:r>
+    </w:p>
+    <w:p>
+      <w:pPr>
+        <w:jc w:val="both"/>
+        <w:rPr>
+          <w:noProof/>
+        </w:rPr>
+      </w:pPr>
+      <w:r>
+        <w:rPr>
+          <w:noProof/>
+        </w:rPr>
+        <w:t>Comenzar a estudiar fuentes de no-linealidad</w:t>
+      </w:r>
+    </w:p>
+    <w:p>
+      <w:pPr>
+        <w:pStyle w:val="Prrafodelista"/>
+        <w:numPr>
+          <w:ilvl w:val="0"/>
+          <w:numId w:val="2"/>
+        </w:numPr>
+        <w:jc w:val="both"/>
+      </w:pPr>
+      <w:r>
+        <w:t>Dispersión</w:t>
+      </w:r>
+      <w:r>
+        <w:t>/cromaticidad.</w:t>
+      </w:r>
+    </w:p>
+    <w:p>
+      <w:pPr>
+        <w:pStyle w:val="Prrafodelista"/>
+        <w:numPr>
+          <w:ilvl w:val="0"/>
+          <w:numId w:val="2"/>
+        </w:numPr>
+        <w:jc w:val="both"/>
+      </w:pPr>
+      <w:r>
+        <w:t>Cuadrupolos.</w:t>
+      </w:r>
+    </w:p>
+    <w:p>
+      <w:pPr>
+        <w:jc w:val="both"/>
+      </w:pPr>
+      <w:r>
+        <w:t>Impacto en la estabilidad de la órbita</w:t>
+      </w:r>
+    </w:p>
+    <w:p>
+      <w:pPr>
+        <w:jc w:val="both"/>
+      </w:pPr>
+      <w:r>
+        <w:t>Impacto en el h</w:t>
+      </w:r>
+      <w:r>
+        <w:t xml:space="preserve"> (¿Necesitamos h&lt;&lt;0 cuando la inestabilidad es más loca?)</w:t>
+      </w:r>
+    </w:p>
+    <w:p>
+      <w:pPr>
+        <w:jc w:val="both"/>
+      </w:pPr>
     </w:p>
     <w:sectPr>
       <w:pgSz w:w="11906" w:h="16838"/>

</xml_diff>